<commit_message>
docs: add hackathon prep materials and demo deck
</commit_message>
<xml_diff>
--- a/Example workflow prompts.docx
+++ b/Example workflow prompts.docx
@@ -3,6 +3,21 @@
 <w:document xmlns:wpc="http://schemas.microsoft.com/office/word/2010/wordprocessingCanvas" xmlns:cx="http://schemas.microsoft.com/office/drawing/2014/chartex" xmlns:cx1="http://schemas.microsoft.com/office/drawing/2015/9/8/chartex" xmlns:cx2="http://schemas.microsoft.com/office/drawing/2015/10/21/chartex" xmlns:cx3="http://schemas.microsoft.com/office/drawing/2016/5/9/chartex" xmlns:cx4="http://schemas.microsoft.com/office/drawing/2016/5/10/chartex" xmlns:cx5="http://schemas.microsoft.com/office/drawing/2016/5/11/chartex" xmlns:cx6="http://schemas.microsoft.com/office/drawing/2016/5/12/chartex" xmlns:cx7="http://schemas.microsoft.com/office/drawing/2016/5/13/chartex" xmlns:cx8="http://schemas.microsoft.com/office/drawing/2016/5/14/chartex" xmlns:mc="http://schemas.openxmlformats.org/markup-compatibility/2006" xmlns:m="http://schemas.openxmlformats.org/officeDocument/2006/math" xmlns:aink="http://schemas.microsoft.com/office/drawing/2016/ink" xmlns:am3d="http://schemas.microsoft.com/office/drawing/2017/model3d" xmlns:oel="http://schemas.microsoft.com/office/2019/extlst" xmlns:r="http://schemas.openxmlformats.org/officeDocument/2006/relationships" xmlns:wp14="http://schemas.microsoft.com/office/word/2010/wordprocessingDrawing" xmlns:wp="http://schemas.openxmlformats.org/drawingml/2006/wordprocessingDrawing" xmlns:wpg="http://schemas.microsoft.com/office/word/2010/wordprocessingGroup" xmlns:wpi="http://schemas.microsoft.com/office/word/2010/wordprocessingInk" xmlns:wps="http://schemas.microsoft.com/office/word/2010/wordprocessingShape" xmlns:o="urn:schemas-microsoft-com:office:office" xmlns:v="urn:schemas-microsoft-com:vml" xmlns:w10="urn:schemas-microsoft-com:office:word" xmlns:w="http://schemas.openxmlformats.org/wordprocessingml/2006/main" xmlns:w14="http://schemas.microsoft.com/office/word/2010/wordml" xmlns:w15="http://schemas.microsoft.com/office/word/2012/wordml" xmlns:w16cex="http://schemas.microsoft.com/office/word/2018/wordml/cex" xmlns:w16cid="http://schemas.microsoft.com/office/word/2016/wordml/cid" xmlns:w16="http://schemas.microsoft.com/office/word/2018/wordml" xmlns:w16sdtdh="http://schemas.microsoft.com/office/word/2020/wordml/sdtdatahash" xmlns:w16sdtfl="http://schemas.microsoft.com/office/word/2024/wordml/sdtformatlock" xmlns:w16se="http://schemas.microsoft.com/office/word/2015/wordml/symex" xmlns:w16du="http://schemas.microsoft.com/office/word/2023/wordml/word16du" xmlns:wne="http://schemas.microsoft.com/office/word/2006/wordml" mc:Ignorable="w14 w15 w16se w16cid w16 w16cex w16sdtdh w16sdtfl w16du wp14">
   <w:body>
     <w:p>
+      <w:pPr>
+        <w:rPr>
+          <w:b/>
+          <w:bCs/>
+        </w:rPr>
+      </w:pPr>
+      <w:r>
+        <w:rPr>
+          <w:b/>
+          <w:bCs/>
+        </w:rPr>
+        <w:t>PROMPT 1</w:t>
+      </w:r>
+    </w:p>
+    <w:p>
       <w:r>
         <w:t>We have selected our Tandem hackathon problem.</w:t>
       </w:r>
@@ -175,170 +190,519 @@
     </w:p>
     <w:p>
       <w:r>
+        <w:lastRenderedPageBreak/>
         <w:t xml:space="preserve">   Owner: API/mock integrations.</w:t>
       </w:r>
     </w:p>
     <w:p>
       <w:r>
+        <w:t xml:space="preserve">   Examples: create follow-up task, draft/send patient communication, schedule review.</w:t>
+      </w:r>
+    </w:p>
+    <w:p/>
+    <w:p>
+      <w:r>
+        <w:t>8. Closure</w:t>
+      </w:r>
+    </w:p>
+    <w:p>
+      <w:r>
+        <w:t xml:space="preserve">   Owner: deterministic.</w:t>
+      </w:r>
+    </w:p>
+    <w:p>
+      <w:r>
+        <w:t xml:space="preserve">   Behaviour: track whether required actions have completed and mark the loop closed.</w:t>
+      </w:r>
+    </w:p>
+    <w:p/>
+    <w:p>
+      <w:r>
+        <w:t>9. Exceptions</w:t>
+      </w:r>
+    </w:p>
+    <w:p>
+      <w:r>
+        <w:t xml:space="preserve">   Owner: human.</w:t>
+      </w:r>
+    </w:p>
+    <w:p>
+      <w:r>
+        <w:t xml:space="preserve">   Ambiguous, conflicting or unexpected states must escalate rather than be guessed.</w:t>
+      </w:r>
+    </w:p>
+    <w:p/>
+    <w:p>
+      <w:r>
+        <w:t>DESIGN PRINCIPLES</w:t>
+      </w:r>
+    </w:p>
+    <w:p/>
+    <w:p>
+      <w:r>
+        <w:t>- Build a workflow, not a chatbot.</w:t>
+      </w:r>
+    </w:p>
+    <w:p>
+      <w:r>
+        <w:t>- Do not create autonomous clinical decision-making.</w:t>
+      </w:r>
+    </w:p>
+    <w:p>
+      <w:r>
+        <w:t>- Use deterministic code wherever rules are sufficient.</w:t>
+      </w:r>
+    </w:p>
+    <w:p>
+      <w:r>
+        <w:t>- Use LLMs only for genuinely unstructured language tasks.</w:t>
+      </w:r>
+    </w:p>
+    <w:p>
+      <w:r>
+        <w:t>- Use structured/schema-constrained LLM outputs.</w:t>
+      </w:r>
+    </w:p>
+    <w:p>
+      <w:r>
+        <w:t>- Make external integrations mockable.</w:t>
+      </w:r>
+    </w:p>
+    <w:p>
+      <w:r>
+        <w:t>- Keep an audit trail showing AI vs deterministic vs human actions.</w:t>
+      </w:r>
+    </w:p>
+    <w:p>
+      <w:r>
+        <w:t xml:space="preserve">- Optimise for a compelling </w:t>
+      </w:r>
+      <w:proofErr w:type="gramStart"/>
+      <w:r>
+        <w:t>2-3 minute</w:t>
+      </w:r>
+      <w:proofErr w:type="gramEnd"/>
+      <w:r>
+        <w:t xml:space="preserve"> live demonstration.</w:t>
+      </w:r>
+    </w:p>
+    <w:p>
+      <w:r>
+        <w:t>- We have only around 2 hours of practical implementation time.</w:t>
+      </w:r>
+    </w:p>
+    <w:p/>
+    <w:p>
+      <w:r>
+        <w:t>FIRST TASK</w:t>
+      </w:r>
+    </w:p>
+    <w:p/>
+    <w:p>
+      <w:r>
+        <w:t>Before writing code:</w:t>
+      </w:r>
+    </w:p>
+    <w:p/>
+    <w:p>
+      <w:r>
+        <w:t>1. Critique this proposed workflow.</w:t>
+      </w:r>
+    </w:p>
+    <w:p>
+      <w:r>
+        <w:t>2. Identify anything redundant or unnecessarily complicated.</w:t>
+      </w:r>
+    </w:p>
+    <w:p>
+      <w:r>
+        <w:t>3. Identify any missing state or failure condition required for the demo.</w:t>
+      </w:r>
+    </w:p>
+    <w:p>
+      <w:r>
+        <w:t>4. Propose the SMALLEST vertical slice that demonstrates the core value.</w:t>
+      </w:r>
+    </w:p>
+    <w:p>
+      <w:r>
+        <w:t>5. Define the exact happy-path demo.</w:t>
+      </w:r>
+    </w:p>
+    <w:p>
+      <w:r>
+        <w:t>6. Define ONE deliberately difficult/ambiguous case that should escalate.</w:t>
+      </w:r>
+    </w:p>
+    <w:p>
+      <w:r>
+        <w:t>7. Propose the simplest technical architecture you can implement rapidly in this repository.</w:t>
+      </w:r>
+    </w:p>
+    <w:p>
+      <w:r>
+        <w:t>8. Tell us what you would mock rather than integrate for real.</w:t>
+      </w:r>
+    </w:p>
+    <w:p/>
+    <w:p>
+      <w:r>
+        <w:t>Do NOT implement anything yet.</w:t>
+      </w:r>
+    </w:p>
+    <w:p/>
+    <w:p>
+      <w:r>
+        <w:t>Keep the proposal concise. We will approve or modify the architecture before you start building.</w:t>
+      </w:r>
+    </w:p>
+    <w:p>
+      <w:r>
+        <w:br w:type="page"/>
+      </w:r>
+    </w:p>
+    <w:p>
+      <w:pPr>
+        <w:rPr>
+          <w:b/>
+          <w:bCs/>
+        </w:rPr>
+      </w:pPr>
+      <w:r>
+        <w:rPr>
+          <w:b/>
+          <w:bCs/>
+        </w:rPr>
         <w:lastRenderedPageBreak/>
-        <w:t xml:space="preserve">   Examples: create follow-up task, draft/send patient communication, schedule review.</w:t>
-      </w:r>
-    </w:p>
-    <w:p/>
-    <w:p>
-      <w:r>
-        <w:t>8. Closure</w:t>
-      </w:r>
-    </w:p>
-    <w:p>
-      <w:r>
-        <w:t xml:space="preserve">   Owner: deterministic.</w:t>
-      </w:r>
-    </w:p>
-    <w:p>
-      <w:r>
-        <w:t xml:space="preserve">   Behaviour: track whether required actions have completed and mark the loop closed.</w:t>
-      </w:r>
-    </w:p>
-    <w:p/>
-    <w:p>
-      <w:r>
-        <w:t>9. Exceptions</w:t>
-      </w:r>
-    </w:p>
-    <w:p>
-      <w:r>
-        <w:t xml:space="preserve">   Owner: human.</w:t>
-      </w:r>
-    </w:p>
-    <w:p>
-      <w:r>
-        <w:t xml:space="preserve">   Ambiguous, conflicting or unexpected states must escalate rather than be guessed.</w:t>
-      </w:r>
-    </w:p>
-    <w:p/>
-    <w:p>
-      <w:r>
-        <w:t>DESIGN PRINCIPLES</w:t>
-      </w:r>
-    </w:p>
-    <w:p/>
-    <w:p>
-      <w:r>
-        <w:t>- Build a workflow, not a chatbot.</w:t>
-      </w:r>
-    </w:p>
-    <w:p>
-      <w:r>
-        <w:t>- Do not create autonomous clinical decision-making.</w:t>
-      </w:r>
-    </w:p>
-    <w:p>
-      <w:r>
-        <w:t>- Use deterministic code wherever rules are sufficient.</w:t>
-      </w:r>
-    </w:p>
-    <w:p>
-      <w:r>
-        <w:t>- Use LLMs only for genuinely unstructured language tasks.</w:t>
-      </w:r>
-    </w:p>
-    <w:p>
-      <w:r>
-        <w:t>- Use structured/schema-constrained LLM outputs.</w:t>
-      </w:r>
-    </w:p>
-    <w:p>
-      <w:r>
-        <w:t>- Make external integrations mockable.</w:t>
-      </w:r>
-    </w:p>
-    <w:p>
-      <w:r>
-        <w:t>- Keep an audit trail showing AI vs deterministic vs human actions.</w:t>
-      </w:r>
-    </w:p>
-    <w:p>
-      <w:r>
-        <w:t xml:space="preserve">- Optimise for a compelling </w:t>
-      </w:r>
-      <w:proofErr w:type="gramStart"/>
-      <w:r>
-        <w:t>2-3 minute</w:t>
-      </w:r>
-      <w:proofErr w:type="gramEnd"/>
-      <w:r>
-        <w:t xml:space="preserve"> live demonstration.</w:t>
-      </w:r>
-    </w:p>
-    <w:p>
-      <w:r>
-        <w:t>- We have only around 2 hours of practical implementation time.</w:t>
-      </w:r>
-    </w:p>
-    <w:p/>
-    <w:p>
-      <w:r>
-        <w:t>FIRST TASK</w:t>
-      </w:r>
-    </w:p>
-    <w:p/>
-    <w:p>
-      <w:r>
-        <w:t>Before writing code:</w:t>
-      </w:r>
-    </w:p>
-    <w:p/>
-    <w:p>
-      <w:r>
-        <w:t>1. Critique this proposed workflow.</w:t>
-      </w:r>
-    </w:p>
-    <w:p>
-      <w:r>
-        <w:t>2. Identify anything redundant or unnecessarily complicated.</w:t>
-      </w:r>
-    </w:p>
-    <w:p>
-      <w:r>
-        <w:t>3. Identify any missing state or failure condition required for the demo.</w:t>
-      </w:r>
-    </w:p>
-    <w:p>
-      <w:r>
-        <w:t>4. Propose the SMALLEST vertical slice that demonstrates the core value.</w:t>
-      </w:r>
-    </w:p>
-    <w:p>
-      <w:r>
-        <w:t>5. Define the exact happy-path demo.</w:t>
-      </w:r>
-    </w:p>
-    <w:p>
-      <w:r>
-        <w:t>6. Define ONE deliberately difficult/ambiguous case that should escalate.</w:t>
-      </w:r>
-    </w:p>
-    <w:p>
-      <w:r>
-        <w:t>7. Propose the simplest technical architecture you can implement rapidly in this repository.</w:t>
-      </w:r>
-    </w:p>
-    <w:p>
-      <w:r>
-        <w:t>8. Tell us what you would mock rather than integrate for real.</w:t>
-      </w:r>
-    </w:p>
-    <w:p/>
-    <w:p>
-      <w:r>
-        <w:t>Do NOT implement anything yet.</w:t>
-      </w:r>
-    </w:p>
-    <w:p/>
-    <w:p>
-      <w:r>
-        <w:t>Keep the proposal concise. We will approve or modify the architecture before you start building.</w:t>
+        <w:t xml:space="preserve">PROMPT </w:t>
+      </w:r>
+      <w:r>
+        <w:rPr>
+          <w:b/>
+          <w:bCs/>
+        </w:rPr>
+        <w:t>2</w:t>
+      </w:r>
+    </w:p>
+    <w:p>
+      <w:r>
+        <w:t>Approved, with these changes:</w:t>
+      </w:r>
+    </w:p>
+    <w:p/>
+    <w:p>
+      <w:r>
+        <w:t>[TEAM CHANGES]</w:t>
+      </w:r>
+    </w:p>
+    <w:p/>
+    <w:p>
+      <w:r>
+        <w:t>Now implement the smallest complete vertical slice.</w:t>
+      </w:r>
+    </w:p>
+    <w:p/>
+    <w:p>
+      <w:r>
+        <w:t>Priority order:</w:t>
+      </w:r>
+    </w:p>
+    <w:p/>
+    <w:p>
+      <w:r>
+        <w:t>P0 - MUST WORK</w:t>
+      </w:r>
+    </w:p>
+    <w:p>
+      <w:r>
+        <w:t>- happy-path workflow end to end</w:t>
+      </w:r>
+    </w:p>
+    <w:p>
+      <w:r>
+        <w:t>- clear workflow state</w:t>
+      </w:r>
+    </w:p>
+    <w:p>
+      <w:r>
+        <w:t>- clinician decision/approval</w:t>
+      </w:r>
+    </w:p>
+    <w:p>
+      <w:r>
+        <w:t>- mocked downstream action</w:t>
+      </w:r>
+    </w:p>
+    <w:p>
+      <w:r>
+        <w:t>- usable demo UI</w:t>
+      </w:r>
+    </w:p>
+    <w:p/>
+    <w:p>
+      <w:r>
+        <w:t>P1 - ADD NEXT</w:t>
+      </w:r>
+    </w:p>
+    <w:p>
+      <w:r>
+        <w:t>- exception/escalation path</w:t>
+      </w:r>
+    </w:p>
+    <w:p>
+      <w:r>
+        <w:t>- audit trail</w:t>
+      </w:r>
+    </w:p>
+    <w:p/>
+    <w:p>
+      <w:r>
+        <w:t>P2 - ONLY AFTER P0/P1 WORK</w:t>
+      </w:r>
+    </w:p>
+    <w:p>
+      <w:r>
+        <w:t>- synthetic gold evaluation harness</w:t>
+      </w:r>
+    </w:p>
+    <w:p>
+      <w:r>
+        <w:t>- evaluation results view</w:t>
+      </w:r>
+    </w:p>
+    <w:p/>
+    <w:p>
+      <w:r>
+        <w:t>P3 - ONLY IF TIME REMAINS</w:t>
+      </w:r>
+    </w:p>
+    <w:p>
+      <w:r>
+        <w:t>- visual polish</w:t>
+      </w:r>
+    </w:p>
+    <w:p>
+      <w:r>
+        <w:t>- additional integrations/features</w:t>
+      </w:r>
+    </w:p>
+    <w:p/>
+    <w:p>
+      <w:r>
+        <w:t>Rules:</w:t>
+      </w:r>
+    </w:p>
+    <w:p>
+      <w:r>
+        <w:t>- Keep the implementation simple.</w:t>
+      </w:r>
+    </w:p>
+    <w:p>
+      <w:r>
+        <w:t>- Do not add infrastructure we do not need.</w:t>
+      </w:r>
+    </w:p>
+    <w:p>
+      <w:r>
+        <w:t>- Do not add autonomous agents unless genuinely necessary.</w:t>
+      </w:r>
+    </w:p>
+    <w:p>
+      <w:r>
+        <w:t>- Do not spend time on authentication.</w:t>
+      </w:r>
+    </w:p>
+    <w:p>
+      <w:r>
+        <w:t>- Mock unavailable external systems behind clearly named interfaces.</w:t>
+      </w:r>
+    </w:p>
+    <w:p>
+      <w:r>
+        <w:t>- Keep the application runnable locally throughout development.</w:t>
+      </w:r>
+    </w:p>
+    <w:p>
+      <w:r>
+        <w:t>- Commit working milestones to GitHub.</w:t>
+      </w:r>
+    </w:p>
+    <w:p>
+      <w:r>
+        <w:t>- Never sacrifice the working happy-path demo for an optional feature.</w:t>
+      </w:r>
+    </w:p>
+    <w:p/>
+    <w:p>
+      <w:r>
+        <w:t>Start by implementing P0.</w:t>
+      </w:r>
+    </w:p>
+    <w:p/>
+    <w:p>
+      <w:r>
+        <w:t>When P0 works, stop and tell us exactly how to run and test the demo before proceeding to P1.</w:t>
+      </w:r>
+    </w:p>
+    <w:p/>
+    <w:p>
+      <w:r>
+        <w:br w:type="page"/>
+      </w:r>
+    </w:p>
+    <w:p>
+      <w:pPr>
+        <w:rPr>
+          <w:b/>
+          <w:bCs/>
+        </w:rPr>
+      </w:pPr>
+      <w:r>
+        <w:rPr>
+          <w:b/>
+          <w:bCs/>
+        </w:rPr>
+        <w:lastRenderedPageBreak/>
+        <w:t>PROMPT 3</w:t>
+      </w:r>
+    </w:p>
+    <w:p>
+      <w:pPr>
+        <w:rPr>
+          <w:b/>
+          <w:bCs/>
+        </w:rPr>
+      </w:pPr>
+    </w:p>
+    <w:p>
+      <w:r>
+        <w:t>The core workflow is now working.</w:t>
+      </w:r>
+    </w:p>
+    <w:p/>
+    <w:p>
+      <w:r>
+        <w:t>We want to add a small synthetic gold evaluation set.</w:t>
+      </w:r>
+    </w:p>
+    <w:p/>
+    <w:p>
+      <w:r>
+        <w:t>Here are the behaviours our clinician/team says the system must demonstrate:</w:t>
+      </w:r>
+    </w:p>
+    <w:p/>
+    <w:p>
+      <w:r>
+        <w:t>[PASTE CASES + EXPECTED BEHAVIOUR]</w:t>
+      </w:r>
+    </w:p>
+    <w:p/>
+    <w:p>
+      <w:r>
+        <w:t>Create 10-15 synthetic test cases covering:</w:t>
+      </w:r>
+    </w:p>
+    <w:p>
+      <w:r>
+        <w:t>- routine cases</w:t>
+      </w:r>
+    </w:p>
+    <w:p>
+      <w:r>
+        <w:t>- edge cases</w:t>
+      </w:r>
+    </w:p>
+    <w:p>
+      <w:r>
+        <w:t>- conflicting/ambiguous inputs</w:t>
+      </w:r>
+    </w:p>
+    <w:p>
+      <w:r>
+        <w:t>- escalation behaviour</w:t>
+      </w:r>
+    </w:p>
+    <w:p/>
+    <w:p>
+      <w:r>
+        <w:t>Do not invent new clinical decision rules.</w:t>
+      </w:r>
+    </w:p>
+    <w:p/>
+    <w:p>
+      <w:r>
+        <w:t>For each case, store:</w:t>
+      </w:r>
+    </w:p>
+    <w:p>
+      <w:r>
+        <w:t>- synthetic input</w:t>
+      </w:r>
+    </w:p>
+    <w:p>
+      <w:r>
+        <w:t>- expected structured workflow output/state</w:t>
+      </w:r>
+    </w:p>
+    <w:p>
+      <w:r>
+        <w:t>- expected escalation status</w:t>
+      </w:r>
+    </w:p>
+    <w:p>
+      <w:r>
+        <w:t>- expected downstream action</w:t>
+      </w:r>
+    </w:p>
+    <w:p/>
+    <w:p>
+      <w:r>
+        <w:t>Run the cases through the SAME underlying workflow used by the application.</w:t>
+      </w:r>
+    </w:p>
+    <w:p/>
+    <w:p>
+      <w:r>
+        <w:t>Compare actual vs expected results programmatically.</w:t>
+      </w:r>
+    </w:p>
+    <w:p/>
+    <w:p>
+      <w:r>
+        <w:t>Produce:</w:t>
+      </w:r>
+    </w:p>
+    <w:p>
+      <w:r>
+        <w:t>- total passed</w:t>
+      </w:r>
+    </w:p>
+    <w:p>
+      <w:r>
+        <w:t>- total failed</w:t>
+      </w:r>
+    </w:p>
+    <w:p>
+      <w:r>
+        <w:t>- pass percentage</w:t>
+      </w:r>
+    </w:p>
+    <w:p>
+      <w:r>
+        <w:t>- escalation cases passed/failed</w:t>
+      </w:r>
+    </w:p>
+    <w:p/>
+    <w:p>
+      <w:r>
+        <w:t>Make the results easy to show during the hackathon presentation.</w:t>
+      </w:r>
+    </w:p>
+    <w:p/>
+    <w:p>
+      <w:r>
+        <w:t>Do not modify the production workflow merely to make the evaluation pass. Report failures honestly.</w:t>
       </w:r>
     </w:p>
     <w:sectPr>

</xml_diff>

<commit_message>
feat: PlugPoint P0 - note to tracked action plan with clinician approval, mocked actions and demo UI
</commit_message>
<xml_diff>
--- a/Example workflow prompts.docx
+++ b/Example workflow prompts.docx
@@ -30,259 +30,300 @@
     </w:p>
     <w:p>
       <w:r>
-        <w:t xml:space="preserve">Clinicians order investigations whose results arrive asynchronously. They then </w:t>
+        <w:t xml:space="preserve">Patients being lost to follow-up </w:t>
+      </w:r>
+    </w:p>
+    <w:p>
+      <w:r>
+        <w:t>Clinicians’ time and secretaries’ availability</w:t>
+      </w:r>
+    </w:p>
+    <w:p/>
+    <w:p>
+      <w:r>
+        <w:t>USER</w:t>
+      </w:r>
+    </w:p>
+    <w:p>
+      <w:r>
+        <w:t>Consultant specialists/registrars etc.</w:t>
+      </w:r>
+    </w:p>
+    <w:p/>
+    <w:p>
+      <w:r>
+        <w:t>CURRENT WORKFLOW</w:t>
+      </w:r>
+    </w:p>
+    <w:p>
+      <w:r>
+        <w:t>Outpatient clinic consultation ends; manual action plan needed (requesting scans/further investigations/follow-up)</w:t>
+      </w:r>
+    </w:p>
+    <w:p/>
+    <w:p>
+      <w:r>
+        <w:t>PAIN POINTS</w:t>
+      </w:r>
+    </w:p>
+    <w:p>
+      <w:r>
+        <w:t>Multiple emails</w:t>
+      </w:r>
+    </w:p>
+    <w:p>
+      <w:r>
+        <w:t xml:space="preserve">Patient uncertainty </w:t>
+      </w:r>
+    </w:p>
+    <w:p>
+      <w:r>
+        <w:t>Workforce burnout</w:t>
+      </w:r>
+    </w:p>
+    <w:p/>
+    <w:p>
+      <w:r>
+        <w:t>TARGET WORKFLOW</w:t>
+      </w:r>
+    </w:p>
+    <w:p/>
+    <w:p>
+      <w:r>
+        <w:t xml:space="preserve">Initial </w:t>
+      </w:r>
+      <w:r>
+        <w:t>appointment</w:t>
+      </w:r>
+      <w:r>
+        <w:t xml:space="preserve"> </w:t>
+      </w:r>
+      <w:r>
+        <w:t xml:space="preserve">(Tandem integration; assistance in output notes &amp; action plan). </w:t>
+      </w:r>
+    </w:p>
+    <w:p/>
+    <w:p>
+      <w:r>
+        <w:t>Plan from initial OPD needs to be actioned; some manual, some LLM</w:t>
+      </w:r>
+    </w:p>
+    <w:p>
+      <w:r>
+        <w:t>--</w:t>
+      </w:r>
+    </w:p>
+    <w:p/>
+    <w:p>
+      <w:r>
+        <w:t xml:space="preserve">1. </w:t>
+      </w:r>
+      <w:r>
+        <w:t>Investigations</w:t>
+      </w:r>
+      <w:r>
+        <w:t xml:space="preserve"> request (</w:t>
+      </w:r>
+      <w:proofErr w:type="spellStart"/>
+      <w:r>
+        <w:t>eg</w:t>
+      </w:r>
+      <w:proofErr w:type="spellEnd"/>
+      <w:r>
+        <w:t>, MRI/CT scan</w:t>
+      </w:r>
+      <w:r>
+        <w:t>s, Bloods, Biopsies</w:t>
+      </w:r>
+      <w:r>
+        <w:t>)</w:t>
+      </w:r>
+    </w:p>
+    <w:p>
+      <w:r>
+        <w:t xml:space="preserve">   Owner: </w:t>
+      </w:r>
+      <w:r>
+        <w:t>clinician</w:t>
+      </w:r>
+    </w:p>
+    <w:p>
+      <w:pPr>
+        <w:tabs>
+          <w:tab w:val="left" w:pos="3881"/>
+        </w:tabs>
+      </w:pPr>
+      <w:r>
+        <w:t xml:space="preserve">   Behaviour: </w:t>
+      </w:r>
+      <w:r>
+        <w:t>clinician orders scan</w:t>
+      </w:r>
+      <w:r>
+        <w:t xml:space="preserve"> &amp; provides clinical reasoning, clinical context (utilising Tandem summaries as above)</w:t>
+      </w:r>
+    </w:p>
+    <w:p/>
+    <w:p>
+      <w:r>
+        <w:t xml:space="preserve">2. Scheduling </w:t>
+      </w:r>
+      <w:r>
+        <w:t>next/follow up a</w:t>
+      </w:r>
+      <w:r>
+        <w:t>ppointment to discuss results</w:t>
+      </w:r>
+      <w:r>
+        <w:t xml:space="preserve"> on dashboard w/ appropriate clinician (if SpR, may need consultant review next time)clinician can utilise Tandem to verbalise a f/u is needed, time frame &amp; </w:t>
+      </w:r>
+      <w:r>
+        <w:t>clinician</w:t>
+      </w:r>
+      <w:r>
+        <w:t xml:space="preserve"> w/ is specified at this point. </w:t>
+      </w:r>
+    </w:p>
+    <w:p>
+      <w:r>
+        <w:t xml:space="preserve">   Owner: LLM</w:t>
+      </w:r>
+    </w:p>
+    <w:p>
+      <w:r>
+        <w:t xml:space="preserve">   Behaviour: LLM schedules appt and pulls results into</w:t>
+      </w:r>
+      <w:r>
+        <w:t xml:space="preserve"> patient profile ready for review for next follow up OPD (scan results, investigation results, summary of previous appointment &amp; action plan, allowing for continuity of care, more engaging </w:t>
+      </w:r>
+    </w:p>
+    <w:p>
+      <w:pPr>
+        <w:tabs>
+          <w:tab w:val="left" w:pos="8325"/>
+        </w:tabs>
+      </w:pPr>
+    </w:p>
+    <w:p>
+      <w:pPr>
+        <w:tabs>
+          <w:tab w:val="left" w:pos="8325"/>
+        </w:tabs>
+      </w:pPr>
+      <w:r>
+        <w:t xml:space="preserve">3. </w:t>
+      </w:r>
+      <w:r>
+        <w:t>Tool integrates w/ existing EPR system &amp; dashboard.</w:t>
+      </w:r>
+      <w:r>
+        <w:tab/>
+      </w:r>
+    </w:p>
+    <w:p>
+      <w:pPr>
+        <w:tabs>
+          <w:tab w:val="left" w:pos="8325"/>
+        </w:tabs>
+      </w:pPr>
+    </w:p>
+    <w:p>
+      <w:pPr>
+        <w:tabs>
+          <w:tab w:val="left" w:pos="8325"/>
+        </w:tabs>
+      </w:pPr>
+      <w:r>
+        <w:t xml:space="preserve">4. </w:t>
+      </w:r>
+      <w:r>
+        <w:t>A</w:t>
+      </w:r>
+      <w:r>
+        <w:t xml:space="preserve">utomated </w:t>
+      </w:r>
+      <w:r>
+        <w:t>A</w:t>
+      </w:r>
+      <w:r>
+        <w:t xml:space="preserve">ppointment reminders </w:t>
+      </w:r>
+      <w:r>
+        <w:t>for patients</w:t>
+      </w:r>
+    </w:p>
+    <w:p>
+      <w:pPr>
+        <w:tabs>
+          <w:tab w:val="left" w:pos="8325"/>
+        </w:tabs>
+      </w:pPr>
+    </w:p>
+    <w:p>
+      <w:r>
+        <w:t xml:space="preserve">We’re calling our solution </w:t>
+      </w:r>
+      <w:proofErr w:type="spellStart"/>
+      <w:r>
+        <w:t>PlugPoint</w:t>
+      </w:r>
+      <w:proofErr w:type="spellEnd"/>
+    </w:p>
+    <w:p/>
+    <w:p/>
+    <w:p/>
+    <w:p>
+      <w:r>
+        <w:lastRenderedPageBreak/>
+        <w:t>DESIGN PRINCIPLES</w:t>
+      </w:r>
+    </w:p>
+    <w:p/>
+    <w:p>
+      <w:r>
+        <w:t>- Build a workflow, not a chatbot.</w:t>
+      </w:r>
+    </w:p>
+    <w:p>
+      <w:r>
+        <w:t>- Do not create autonomous clinical decision-making.</w:t>
+      </w:r>
+    </w:p>
+    <w:p>
+      <w:r>
+        <w:t>- Use deterministic code wherever rules are sufficient.</w:t>
+      </w:r>
+    </w:p>
+    <w:p>
+      <w:r>
+        <w:t>- Use LLMs only for genuinely unstructured language tasks.</w:t>
+      </w:r>
+    </w:p>
+    <w:p>
+      <w:r>
+        <w:t>- Use structured/schema-constrained LLM outputs.</w:t>
+      </w:r>
+    </w:p>
+    <w:p>
+      <w:r>
+        <w:t>- Make external integrations mockable.</w:t>
+      </w:r>
+    </w:p>
+    <w:p>
+      <w:r>
+        <w:t>- Keep an audit trail showing AI vs deterministic vs human actions.</w:t>
+      </w:r>
+    </w:p>
+    <w:p>
+      <w:r>
+        <w:t xml:space="preserve">- Optimise for a compelling </w:t>
       </w:r>
       <w:proofErr w:type="gramStart"/>
       <w:r>
-        <w:t>have to</w:t>
+        <w:t>2-3 minute</w:t>
       </w:r>
       <w:proofErr w:type="gramEnd"/>
       <w:r>
-        <w:t xml:space="preserve"> manually identify outstanding results, review them, initiate follow-up actions, communicate with patients and remember whether those actions were completed.</w:t>
-      </w:r>
-    </w:p>
-    <w:p/>
-    <w:p>
-      <w:r>
-        <w:t>The administrative problem we want to solve is not clinical interpretation of the result itself. It is closing the loop around the result.</w:t>
-      </w:r>
-    </w:p>
-    <w:p/>
-    <w:p>
-      <w:r>
-        <w:t>USER</w:t>
-      </w:r>
-    </w:p>
-    <w:p>
-      <w:r>
-        <w:t>[GP / clinician - replace with our actual user]</w:t>
-      </w:r>
-    </w:p>
-    <w:p/>
-    <w:p>
-      <w:r>
-        <w:t>CURRENT WORKFLOW</w:t>
-      </w:r>
-    </w:p>
-    <w:p>
-      <w:r>
-        <w:t>[Paste our team's description of the real current workflow here.]</w:t>
-      </w:r>
-    </w:p>
-    <w:p/>
-    <w:p>
-      <w:r>
-        <w:t>PAIN POINTS</w:t>
-      </w:r>
-    </w:p>
-    <w:p>
-      <w:r>
-        <w:t>[Paste what our clinician teammate told us.]</w:t>
-      </w:r>
-    </w:p>
-    <w:p/>
-    <w:p>
-      <w:r>
-        <w:t>TARGET WORKFLOW</w:t>
-      </w:r>
-    </w:p>
-    <w:p/>
-    <w:p>
-      <w:r>
-        <w:t>1. Investigation ordered</w:t>
-      </w:r>
-    </w:p>
-    <w:p>
-      <w:r>
-        <w:t xml:space="preserve">   Owner: deterministic/API</w:t>
-      </w:r>
-    </w:p>
-    <w:p>
-      <w:r>
-        <w:t xml:space="preserve">   Behaviour: register expected result and responsible clinician.</w:t>
-      </w:r>
-    </w:p>
-    <w:p/>
-    <w:p>
-      <w:r>
-        <w:t>2. Result arrives</w:t>
-      </w:r>
-    </w:p>
-    <w:p>
-      <w:r>
-        <w:t xml:space="preserve">   Owner: deterministic/API</w:t>
-      </w:r>
-    </w:p>
-    <w:p>
-      <w:r>
-        <w:t xml:space="preserve">   Behaviour: match result to outstanding investigation and update workflow state.</w:t>
-      </w:r>
-    </w:p>
-    <w:p/>
-    <w:p>
-      <w:r>
-        <w:t>3. Relevant information extracted/organised</w:t>
-      </w:r>
-    </w:p>
-    <w:p>
-      <w:r>
-        <w:t xml:space="preserve">   Owner: LLM only where unstructured language understanding is required.</w:t>
-      </w:r>
-    </w:p>
-    <w:p>
-      <w:r>
-        <w:t xml:space="preserve">   Behaviour: produce structured output for the workflow.</w:t>
-      </w:r>
-    </w:p>
-    <w:p/>
-    <w:p>
-      <w:r>
-        <w:t>4. Clinical decision</w:t>
-      </w:r>
-    </w:p>
-    <w:p>
-      <w:r>
-        <w:t xml:space="preserve">   Owner: clinician.</w:t>
-      </w:r>
-    </w:p>
-    <w:p>
-      <w:r>
-        <w:t xml:space="preserve">   Behaviour: clinician determines what clinical action, if any, is appropriate.</w:t>
-      </w:r>
-    </w:p>
-    <w:p>
-      <w:r>
-        <w:t xml:space="preserve">   IMPORTANT: the AI must not make this clinical decision.</w:t>
-      </w:r>
-    </w:p>
-    <w:p/>
-    <w:p>
-      <w:r>
-        <w:t>5. Follow-up actions</w:t>
-      </w:r>
-    </w:p>
-    <w:p>
-      <w:r>
-        <w:t xml:space="preserve">   Owner: deterministic workflow + LLM where text generation is required.</w:t>
-      </w:r>
-    </w:p>
-    <w:p>
-      <w:r>
-        <w:t xml:space="preserve">   Behaviour: based on clinician's decision, prepare appropriate downstream actions.</w:t>
-      </w:r>
-    </w:p>
-    <w:p/>
-    <w:p>
-      <w:r>
-        <w:t>6. Clinician approval</w:t>
-      </w:r>
-    </w:p>
-    <w:p>
-      <w:r>
-        <w:t xml:space="preserve">   Owner: human where required.</w:t>
-      </w:r>
-    </w:p>
-    <w:p/>
-    <w:p>
-      <w:r>
-        <w:t>7. Execution</w:t>
-      </w:r>
-    </w:p>
-    <w:p>
-      <w:r>
-        <w:lastRenderedPageBreak/>
-        <w:t xml:space="preserve">   Owner: API/mock integrations.</w:t>
-      </w:r>
-    </w:p>
-    <w:p>
-      <w:r>
-        <w:t xml:space="preserve">   Examples: create follow-up task, draft/send patient communication, schedule review.</w:t>
-      </w:r>
-    </w:p>
-    <w:p/>
-    <w:p>
-      <w:r>
-        <w:t>8. Closure</w:t>
-      </w:r>
-    </w:p>
-    <w:p>
-      <w:r>
-        <w:t xml:space="preserve">   Owner: deterministic.</w:t>
-      </w:r>
-    </w:p>
-    <w:p>
-      <w:r>
-        <w:t xml:space="preserve">   Behaviour: track whether required actions have completed and mark the loop closed.</w:t>
-      </w:r>
-    </w:p>
-    <w:p/>
-    <w:p>
-      <w:r>
-        <w:t>9. Exceptions</w:t>
-      </w:r>
-    </w:p>
-    <w:p>
-      <w:r>
-        <w:t xml:space="preserve">   Owner: human.</w:t>
-      </w:r>
-    </w:p>
-    <w:p>
-      <w:r>
-        <w:t xml:space="preserve">   Ambiguous, conflicting or unexpected states must escalate rather than be guessed.</w:t>
-      </w:r>
-    </w:p>
-    <w:p/>
-    <w:p>
-      <w:r>
-        <w:t>DESIGN PRINCIPLES</w:t>
-      </w:r>
-    </w:p>
-    <w:p/>
-    <w:p>
-      <w:r>
-        <w:t>- Build a workflow, not a chatbot.</w:t>
-      </w:r>
-    </w:p>
-    <w:p>
-      <w:r>
-        <w:t>- Do not create autonomous clinical decision-making.</w:t>
-      </w:r>
-    </w:p>
-    <w:p>
-      <w:r>
-        <w:t>- Use deterministic code wherever rules are sufficient.</w:t>
-      </w:r>
-    </w:p>
-    <w:p>
-      <w:r>
-        <w:t>- Use LLMs only for genuinely unstructured language tasks.</w:t>
-      </w:r>
-    </w:p>
-    <w:p>
-      <w:r>
-        <w:t>- Use structured/schema-constrained LLM outputs.</w:t>
-      </w:r>
-    </w:p>
-    <w:p>
-      <w:r>
-        <w:t>- Make external integrations mockable.</w:t>
-      </w:r>
-    </w:p>
-    <w:p>
-      <w:r>
-        <w:t>- Keep an audit trail showing AI vs deterministic vs human actions.</w:t>
-      </w:r>
-    </w:p>
-    <w:p>
-      <w:r>
-        <w:t xml:space="preserve">- Optimise for a compelling </w:t>
-      </w:r>
-      <w:proofErr w:type="gramStart"/>
-      <w:r>
-        <w:t>2-3 minute</w:t>
-      </w:r>
-      <w:proofErr w:type="gramEnd"/>
-      <w:r>
         <w:t xml:space="preserve"> live demonstration.</w:t>
       </w:r>
     </w:p>
@@ -356,355 +397,7 @@
         <w:t>Keep the proposal concise. We will approve or modify the architecture before you start building.</w:t>
       </w:r>
     </w:p>
-    <w:p>
-      <w:r>
-        <w:br w:type="page"/>
-      </w:r>
-    </w:p>
-    <w:p>
-      <w:pPr>
-        <w:rPr>
-          <w:b/>
-          <w:bCs/>
-        </w:rPr>
-      </w:pPr>
-      <w:r>
-        <w:rPr>
-          <w:b/>
-          <w:bCs/>
-        </w:rPr>
-        <w:lastRenderedPageBreak/>
-        <w:t xml:space="preserve">PROMPT </w:t>
-      </w:r>
-      <w:r>
-        <w:rPr>
-          <w:b/>
-          <w:bCs/>
-        </w:rPr>
-        <w:t>2</w:t>
-      </w:r>
-    </w:p>
-    <w:p>
-      <w:r>
-        <w:t>Approved, with these changes:</w:t>
-      </w:r>
-    </w:p>
-    <w:p/>
-    <w:p>
-      <w:r>
-        <w:t>[TEAM CHANGES]</w:t>
-      </w:r>
-    </w:p>
-    <w:p/>
-    <w:p>
-      <w:r>
-        <w:t>Now implement the smallest complete vertical slice.</w:t>
-      </w:r>
-    </w:p>
-    <w:p/>
-    <w:p>
-      <w:r>
-        <w:t>Priority order:</w:t>
-      </w:r>
-    </w:p>
-    <w:p/>
-    <w:p>
-      <w:r>
-        <w:t>P0 - MUST WORK</w:t>
-      </w:r>
-    </w:p>
-    <w:p>
-      <w:r>
-        <w:t>- happy-path workflow end to end</w:t>
-      </w:r>
-    </w:p>
-    <w:p>
-      <w:r>
-        <w:t>- clear workflow state</w:t>
-      </w:r>
-    </w:p>
-    <w:p>
-      <w:r>
-        <w:t>- clinician decision/approval</w:t>
-      </w:r>
-    </w:p>
-    <w:p>
-      <w:r>
-        <w:t>- mocked downstream action</w:t>
-      </w:r>
-    </w:p>
-    <w:p>
-      <w:r>
-        <w:t>- usable demo UI</w:t>
-      </w:r>
-    </w:p>
-    <w:p/>
-    <w:p>
-      <w:r>
-        <w:t>P1 - ADD NEXT</w:t>
-      </w:r>
-    </w:p>
-    <w:p>
-      <w:r>
-        <w:t>- exception/escalation path</w:t>
-      </w:r>
-    </w:p>
-    <w:p>
-      <w:r>
-        <w:t>- audit trail</w:t>
-      </w:r>
-    </w:p>
-    <w:p/>
-    <w:p>
-      <w:r>
-        <w:t>P2 - ONLY AFTER P0/P1 WORK</w:t>
-      </w:r>
-    </w:p>
-    <w:p>
-      <w:r>
-        <w:t>- synthetic gold evaluation harness</w:t>
-      </w:r>
-    </w:p>
-    <w:p>
-      <w:r>
-        <w:t>- evaluation results view</w:t>
-      </w:r>
-    </w:p>
-    <w:p/>
-    <w:p>
-      <w:r>
-        <w:t>P3 - ONLY IF TIME REMAINS</w:t>
-      </w:r>
-    </w:p>
-    <w:p>
-      <w:r>
-        <w:t>- visual polish</w:t>
-      </w:r>
-    </w:p>
-    <w:p>
-      <w:r>
-        <w:t>- additional integrations/features</w:t>
-      </w:r>
-    </w:p>
-    <w:p/>
-    <w:p>
-      <w:r>
-        <w:t>Rules:</w:t>
-      </w:r>
-    </w:p>
-    <w:p>
-      <w:r>
-        <w:t>- Keep the implementation simple.</w:t>
-      </w:r>
-    </w:p>
-    <w:p>
-      <w:r>
-        <w:t>- Do not add infrastructure we do not need.</w:t>
-      </w:r>
-    </w:p>
-    <w:p>
-      <w:r>
-        <w:t>- Do not add autonomous agents unless genuinely necessary.</w:t>
-      </w:r>
-    </w:p>
-    <w:p>
-      <w:r>
-        <w:t>- Do not spend time on authentication.</w:t>
-      </w:r>
-    </w:p>
-    <w:p>
-      <w:r>
-        <w:t>- Mock unavailable external systems behind clearly named interfaces.</w:t>
-      </w:r>
-    </w:p>
-    <w:p>
-      <w:r>
-        <w:t>- Keep the application runnable locally throughout development.</w:t>
-      </w:r>
-    </w:p>
-    <w:p>
-      <w:r>
-        <w:t>- Commit working milestones to GitHub.</w:t>
-      </w:r>
-    </w:p>
-    <w:p>
-      <w:r>
-        <w:t>- Never sacrifice the working happy-path demo for an optional feature.</w:t>
-      </w:r>
-    </w:p>
-    <w:p/>
-    <w:p>
-      <w:r>
-        <w:t>Start by implementing P0.</w:t>
-      </w:r>
-    </w:p>
-    <w:p/>
-    <w:p>
-      <w:r>
-        <w:t>When P0 works, stop and tell us exactly how to run and test the demo before proceeding to P1.</w:t>
-      </w:r>
-    </w:p>
-    <w:p/>
-    <w:p>
-      <w:r>
-        <w:br w:type="page"/>
-      </w:r>
-    </w:p>
-    <w:p>
-      <w:pPr>
-        <w:rPr>
-          <w:b/>
-          <w:bCs/>
-        </w:rPr>
-      </w:pPr>
-      <w:r>
-        <w:rPr>
-          <w:b/>
-          <w:bCs/>
-        </w:rPr>
-        <w:lastRenderedPageBreak/>
-        <w:t>PROMPT 3</w:t>
-      </w:r>
-    </w:p>
-    <w:p>
-      <w:pPr>
-        <w:rPr>
-          <w:b/>
-          <w:bCs/>
-        </w:rPr>
-      </w:pPr>
-    </w:p>
-    <w:p>
-      <w:r>
-        <w:t>The core workflow is now working.</w:t>
-      </w:r>
-    </w:p>
-    <w:p/>
-    <w:p>
-      <w:r>
-        <w:t>We want to add a small synthetic gold evaluation set.</w:t>
-      </w:r>
-    </w:p>
-    <w:p/>
-    <w:p>
-      <w:r>
-        <w:t>Here are the behaviours our clinician/team says the system must demonstrate:</w:t>
-      </w:r>
-    </w:p>
-    <w:p/>
-    <w:p>
-      <w:r>
-        <w:t>[PASTE CASES + EXPECTED BEHAVIOUR]</w:t>
-      </w:r>
-    </w:p>
-    <w:p/>
-    <w:p>
-      <w:r>
-        <w:t>Create 10-15 synthetic test cases covering:</w:t>
-      </w:r>
-    </w:p>
-    <w:p>
-      <w:r>
-        <w:t>- routine cases</w:t>
-      </w:r>
-    </w:p>
-    <w:p>
-      <w:r>
-        <w:t>- edge cases</w:t>
-      </w:r>
-    </w:p>
-    <w:p>
-      <w:r>
-        <w:t>- conflicting/ambiguous inputs</w:t>
-      </w:r>
-    </w:p>
-    <w:p>
-      <w:r>
-        <w:t>- escalation behaviour</w:t>
-      </w:r>
-    </w:p>
-    <w:p/>
-    <w:p>
-      <w:r>
-        <w:t>Do not invent new clinical decision rules.</w:t>
-      </w:r>
-    </w:p>
-    <w:p/>
-    <w:p>
-      <w:r>
-        <w:t>For each case, store:</w:t>
-      </w:r>
-    </w:p>
-    <w:p>
-      <w:r>
-        <w:t>- synthetic input</w:t>
-      </w:r>
-    </w:p>
-    <w:p>
-      <w:r>
-        <w:t>- expected structured workflow output/state</w:t>
-      </w:r>
-    </w:p>
-    <w:p>
-      <w:r>
-        <w:t>- expected escalation status</w:t>
-      </w:r>
-    </w:p>
-    <w:p>
-      <w:r>
-        <w:t>- expected downstream action</w:t>
-      </w:r>
-    </w:p>
-    <w:p/>
-    <w:p>
-      <w:r>
-        <w:t>Run the cases through the SAME underlying workflow used by the application.</w:t>
-      </w:r>
-    </w:p>
-    <w:p/>
-    <w:p>
-      <w:r>
-        <w:t>Compare actual vs expected results programmatically.</w:t>
-      </w:r>
-    </w:p>
-    <w:p/>
-    <w:p>
-      <w:r>
-        <w:t>Produce:</w:t>
-      </w:r>
-    </w:p>
-    <w:p>
-      <w:r>
-        <w:t>- total passed</w:t>
-      </w:r>
-    </w:p>
-    <w:p>
-      <w:r>
-        <w:t>- total failed</w:t>
-      </w:r>
-    </w:p>
-    <w:p>
-      <w:r>
-        <w:t>- pass percentage</w:t>
-      </w:r>
-    </w:p>
-    <w:p>
-      <w:r>
-        <w:t>- escalation cases passed/failed</w:t>
-      </w:r>
-    </w:p>
-    <w:p/>
-    <w:p>
-      <w:r>
-        <w:t>Make the results easy to show during the hackathon presentation.</w:t>
-      </w:r>
-    </w:p>
-    <w:p/>
-    <w:p>
-      <w:r>
-        <w:t>Do not modify the production workflow merely to make the evaluation pass. Report failures honestly.</w:t>
-      </w:r>
-    </w:p>
+    <w:p/>
     <w:sectPr>
       <w:pgSz w:w="11900" w:h="16840"/>
       <w:pgMar w:top="1440" w:right="1440" w:bottom="1440" w:left="1440" w:header="708" w:footer="708" w:gutter="0"/>

</xml_diff>